<commit_message>
Keep callout boxes on a single page in the manuscript
Co-Authored-By: Claude Opus 5.5 <noreply@anthropic.com>
Claude-Session: https://claude.ai/code/session_016vd3PbB5zTfnabRMTwfr8b
</commit_message>
<xml_diff>
--- a/book/00_출간준비서_매출은늘었는데왜돈이없을까.docx
+++ b/book/00_출간준비서_매출은늘었는데왜돈이없을까.docx
@@ -725,6 +725,9 @@
         <w:gridCol w:w="9026"/>
       </w:tblGrid>
       <w:tr>
+        <w:trPr>
+          <w:cantSplit/>
+        </w:trPr>
         <w:tc>
           <w:tcPr>
             <w:tcW w:type="dxa" w:w="9026"/>
@@ -2203,6 +2206,9 @@
         <w:gridCol w:w="9026"/>
       </w:tblGrid>
       <w:tr>
+        <w:trPr>
+          <w:cantSplit/>
+        </w:trPr>
         <w:tc>
           <w:tcPr>
             <w:tcW w:type="dxa" w:w="9026"/>

</xml_diff>